<commit_message>
Updating daily and Weekly changes
</commit_message>
<xml_diff>
--- a/Articles/2026/3_DaVinci_Tips_and_Tricks/10_How_to_Change_Clip_Speed_and_Duration_in_DaVinci_Resolve/10 How to Change Clp Speed and Duration in DaVinci Resolve.docx
+++ b/Articles/2026/3_DaVinci_Tips_and_Tricks/10_How_to_Change_Clip_Speed_and_Duration_in_DaVinci_Resolve/10 How to Change Clp Speed and Duration in DaVinci Resolve.docx
@@ -7,10 +7,7 @@
         <w:pStyle w:val="Title"/>
       </w:pPr>
       <w:r>
-        <w:t xml:space="preserve">10 </w:t>
-      </w:r>
-      <w:r>
-        <w:t>How to Change Clip Speed and Duration in DaVinci Resolve</w:t>
+        <w:t>10 How to Change Clip Speed and Duration in DaVinci Resolve</w:t>
       </w:r>
     </w:p>
     <w:p/>
@@ -136,6 +133,9 @@
     <w:p/>
     <w:p>
       <w:r>
+        <w:rPr>
+          <w:noProof/>
+        </w:rPr>
         <w:drawing>
           <wp:inline distT="0" distB="0" distL="0" distR="0" wp14:anchorId="142CDF04" wp14:editId="187465A9">
             <wp:extent cx="3000794" cy="1600423"/>
@@ -176,13 +176,7 @@
     <w:p/>
     <w:p>
       <w:r>
-        <w:t xml:space="preserve"> Right click and select, either change speed</w:t>
-      </w:r>
-      <w:r>
-        <w:t>,</w:t>
-      </w:r>
-      <w:r>
-        <w:t xml:space="preserve"> or duration</w:t>
+        <w:t xml:space="preserve"> </w:t>
       </w:r>
     </w:p>
     <w:p/>
@@ -203,6 +197,9 @@
     </w:p>
     <w:p>
       <w:r>
+        <w:rPr>
+          <w:noProof/>
+        </w:rPr>
         <w:drawing>
           <wp:inline distT="0" distB="0" distL="0" distR="0" wp14:anchorId="4BB777A8" wp14:editId="58764F82">
             <wp:extent cx="4248743" cy="4315427"/>
@@ -250,6 +247,9 @@
     </w:p>
     <w:p>
       <w:r>
+        <w:rPr>
+          <w:noProof/>
+        </w:rPr>
         <w:lastRenderedPageBreak/>
         <w:drawing>
           <wp:inline distT="0" distB="0" distL="0" distR="0" wp14:anchorId="240EBCFA" wp14:editId="64749A1C">
@@ -291,11 +291,23 @@
     <w:p/>
     <w:p>
       <w:r>
-        <w:t>Adding Duration time, can also be done by just stretching out the clip on the timeline and this will also slow down the speed of a clip</w:t>
+        <w:t>Adding Duration time, can also be done by just stretching out the clip on the timeline</w:t>
+      </w:r>
+      <w:r>
+        <w:t>,</w:t>
+      </w:r>
+      <w:r>
+        <w:t xml:space="preserve"> and this will also slow down the speed of a clip</w:t>
+      </w:r>
+      <w:r>
+        <w:t>.</w:t>
       </w:r>
     </w:p>
     <w:p>
       <w:r>
+        <w:rPr>
+          <w:noProof/>
+        </w:rPr>
         <w:drawing>
           <wp:inline distT="0" distB="0" distL="0" distR="0" wp14:anchorId="1C9FD92A" wp14:editId="3B5ADFA6">
             <wp:extent cx="1810003" cy="1895740"/>
@@ -354,11 +366,29 @@
     </w:p>
     <w:p>
       <w:r>
-        <w:t>“Speed controls only appear on clips that contain real video frames.”</w:t>
+        <w:t>Speed controls only appear on clips that</w:t>
+      </w:r>
+      <w:r>
+        <w:t xml:space="preserve"> have been rendered, and</w:t>
+      </w:r>
+      <w:r>
+        <w:t xml:space="preserve"> contain</w:t>
+      </w:r>
+      <w:r>
+        <w:t xml:space="preserve"> actual</w:t>
+      </w:r>
+      <w:r>
+        <w:t xml:space="preserve"> video frames.</w:t>
+      </w:r>
+      <w:r>
+        <w:t xml:space="preserve"> Just setting a few keyframes on a clip with some movement, will make the element appear to move, but you do not have actual video frames until a clip has been rendered, and turned into a real movie clip.</w:t>
       </w:r>
     </w:p>
     <w:p>
       <w:r>
+        <w:rPr>
+          <w:noProof/>
+        </w:rPr>
         <w:drawing>
           <wp:inline distT="0" distB="0" distL="0" distR="0" wp14:anchorId="29D954B5" wp14:editId="11937282">
             <wp:extent cx="3172268" cy="1810003"/>
@@ -493,6 +523,9 @@
     </w:p>
     <w:p>
       <w:r>
+        <w:rPr>
+          <w:noProof/>
+        </w:rPr>
         <w:lastRenderedPageBreak/>
         <w:drawing>
           <wp:inline distT="0" distB="0" distL="0" distR="0" wp14:anchorId="24571190" wp14:editId="3DC0CE04">
@@ -552,6 +585,9 @@
     </w:p>
     <w:p>
       <w:r>
+        <w:rPr>
+          <w:noProof/>
+        </w:rPr>
         <w:drawing>
           <wp:inline distT="0" distB="0" distL="0" distR="0" wp14:anchorId="0D542C93" wp14:editId="713EB53A">
             <wp:extent cx="5068007" cy="4163006"/>
@@ -592,13 +628,7 @@
     <w:p>
       <w:r>
         <w:lastRenderedPageBreak/>
-        <w:t xml:space="preserve">Understanding the difference between duration and speed gives you a lot more control over how your clips behave on the timeline. Duration can be changed on anything, but speed changes only appear once a clip contains real video frames. </w:t>
-      </w:r>
-      <w:r>
-        <w:t>So,</w:t>
-      </w:r>
-      <w:r>
-        <w:t xml:space="preserve"> if you’ve animated something like a Text+ or a PNG, just </w:t>
+        <w:t xml:space="preserve">Understanding the difference between duration and speed gives you a lot more control over how your clips behave on the timeline. Duration can be changed on anything, but speed changes only appear once a clip contains real video frames. So, if you’ve animated something like a Text+ or a PNG, just </w:t>
       </w:r>
       <w:r>
         <w:rPr>
@@ -1404,6 +1434,7 @@
   <w:style w:type="character" w:default="1" w:styleId="DefaultParagraphFont">
     <w:name w:val="Default Paragraph Font"/>
     <w:uiPriority w:val="1"/>
+    <w:semiHidden/>
     <w:unhideWhenUsed/>
   </w:style>
   <w:style w:type="table" w:default="1" w:styleId="TableNormal">

</xml_diff>